<commit_message>
Corresponding author: S. Veeragandham
</commit_message>
<xml_diff>
--- a/paper/Drift_or_Deception_MLWA_final.docx
+++ b/paper/Drift_or_Deception_MLWA_final.docx
@@ -29,7 +29,7 @@
           <w:sz w:val="22"/>
           <w:vertAlign w:val="superscript"/>
         </w:rPr>
-        <w:t>a,*</w:t>
+        <w:t>a</w:t>
       </w:r>
       <w:r>
         <w:rPr>
@@ -68,7 +68,7 @@
           <w:sz w:val="22"/>
           <w:vertAlign w:val="superscript"/>
         </w:rPr>
-        <w:t>a</w:t>
+        <w:t>a,*</w:t>
       </w:r>
     </w:p>
     <w:p>
@@ -106,7 +106,7 @@
         <w:rPr>
           <w:sz w:val="18"/>
         </w:rPr>
-        <w:t xml:space="preserve"> Corresponding author: Pushkal Gupta. E-mail addresses: pushkalgupta2005@gmail.com (P. Gupta), shridhar.m2023@vitstudent.ac.in (S. M), vanka.kaushik2023@vitstudent.ac.in (V. Kaushik), syamasudha.v@vit.ac.in (S. Veeragandham).</w:t>
+        <w:t xml:space="preserve"> Corresponding author: Syamasudha Veeragandham. E-mail addresses: pushkalgupta2005@gmail.com (P. Gupta), shridhar.m2023@vitstudent.ac.in (S. M), vanka.kaushik2023@vitstudent.ac.in (V. Kaushik), syamasudha.v@vit.ac.in (S. Veeragandham).</w:t>
       </w:r>
     </w:p>
     <w:p>

</xml_diff>

<commit_message>
Paper: update author email, drop line numbers, proofread labels and wording
</commit_message>
<xml_diff>
--- a/paper/Drift_or_Deception_MLWA_final.docx
+++ b/paper/Drift_or_Deception_MLWA_final.docx
@@ -106,7 +106,7 @@
         <w:rPr>
           <w:sz w:val="18"/>
         </w:rPr>
-        <w:t xml:space="preserve"> Corresponding author: Syamasudha Veeragandham. E-mail addresses: pushkalgupta2005@gmail.com (P. Gupta), shridhar.m2023@vitstudent.ac.in (S. M), vanka.kaushik2023@vitstudent.ac.in (V. Kaushik), syamasudha.v@vit.ac.in (S. Veeragandham).</w:t>
+        <w:t xml:space="preserve"> Corresponding author: Syamasudha Veeragandham. E-mail addresses: pushkal.gupta2023@vitstudent.ac.in (P. Gupta), shridhar.m2023@vitstudent.ac.in (S. M), vanka.kaushik2023@vitstudent.ac.in (V. Kaushik), syamasudha.v@vit.ac.in (S. Veeragandham).</w:t>
       </w:r>
     </w:p>
     <w:p>
@@ -239,7 +239,7 @@
         <w:t>causes</w:t>
       </w:r>
       <w:r>
-        <w:t xml:space="preserve">, so a system built on them has nothing on which to condition its response, and it does the same thing whatever the reason for the deviation. Recent work has begun to separate faults from attacks [5,17–19] and adversarial from real concept drift [20], but between hypotheses that differ in their signature at the plant, not against an injection deliberately matched to benign ageing; and none of it closes the loop from the verdict to </w:t>
+        <w:t xml:space="preserve">, so a system built on them has nothing on which to condition its response, and it does the same thing whatever the reason for the deviation. Recent work has begun to separate faults from attacks [5,17–19] and adversarial from real concept drift [20], but only between hypotheses that differ in their signature at the plant, not against an injection deliberately matched to benign ageing; and none of it closes the loop from the verdict to </w:t>
       </w:r>
       <w:r>
         <w:rPr>
@@ -5330,7 +5330,7 @@
         <w:jc w:val="both"/>
       </w:pPr>
       <w:r>
-        <w:t>Table 4 answers the first question a reviewer should ask: is a physics-anchored learner more accurate than a strong data-driven one when train and test come from the same distribution? It is not. PIRCAD reaches macro-F1 0.943 with a random forest and 0.962 with gradient boosting; the multi-scale 1D-CNN reaches 0.938 (not significantly different from PIRCAD-rf, p = 0.27) and the generic-feature forest 0.974, significantly higher. Both learned baselines see every raw channel and the actuator command, so in distribution they can learn the coupling the physics encodes. The authors' earlier pipeline (Gen-1), the only comparison in the original version of this work, reaches 0.454: comparing against it alone overstated the contribution.</w:t>
+        <w:t>Table 4 addresses the first question: is a physics-anchored learner more accurate than a strong data-driven one when train and test come from the same distribution? It is not. PIRCAD reaches macro-F1 0.943 with a random forest and 0.962 with gradient boosting; the multi-scale 1D-CNN reaches 0.938 (not significantly different from PIRCAD-rf, p = 0.27) and the generic-feature forest 0.974, significantly higher. Both learned baselines see every raw channel and the actuator command, so in distribution they can learn the coupling the physics encodes. The authors' earlier pipeline (Gen-1), against which our prototype was originally compared, reaches 0.454: a comparison against it alone would overstate the contribution.</w:t>
       </w:r>
     </w:p>
     <w:p>
@@ -5790,7 +5790,7 @@
               <w:rPr>
                 <w:sz w:val="18"/>
               </w:rPr>
-              <w:t>Kalman chi-square</w:t>
+              <w:t>Kalman χ²</w:t>
             </w:r>
           </w:p>
         </w:tc>
@@ -9074,7 +9074,7 @@
         <w:jc w:val="both"/>
       </w:pPr>
       <w:r>
-        <w:t>PIRCAD degrades but does not collapse: its worst condition is noise x3 at macro-F1 0.712, against 0.477 (setpoint 35 C) for the CNN and 0.288 (noise x3) for the generic forest, and its mean over all conditions is 0.889 against 0.810 and 0.817. The residual is invariant to most of what changed — the set-point, the ambient and the plant dynamics enter the expectation as well as the measurement — so only shifts that alter the residual itself hurt. Two of those are real weaknesses. Under the strongest noise shift PIRCAD's false-drift rate rises to 0.23, because the noise-signature features that separate a substituted stream from a drifting one are calibrated to the commissioning noise; and an inaccurate process model (mismatch ×6) raises its false-alarm rate to 0.30. PIRCAD's robustness is therefore conditional on a process model of moderate accuracy, which is the price of judging a channel against physics rather than against its own past.</w:t>
+        <w:t>PIRCAD degrades but does not collapse: its worst condition is sensor noise ×3 at macro-F1 0.712, against 0.477 (set-point 35 °C) for the CNN and 0.288 (sensor noise ×3) for the generic forest, and its mean over all conditions is 0.889 against 0.810 and 0.817. The residual is invariant to most of what changed — the set-point, the ambient and the plant dynamics enter the expectation as well as the measurement — so only shifts that alter the residual itself hurt. Two of those are real weaknesses. Under the strongest noise shift PIRCAD's false-drift rate rises to 0.23, because the noise-signature features that separate a substituted stream from a drifting one are calibrated to the commissioning noise; and an inaccurate process model (mismatch ×6) raises its false-alarm rate to 0.30. PIRCAD's robustness is therefore conditional on a process model of moderate accuracy, which is the price of judging a channel against physics rather than against its own past.</w:t>
       </w:r>
     </w:p>
     <w:p>
@@ -11406,7 +11406,7 @@
               <w:rPr>
                 <w:sz w:val="16"/>
               </w:rPr>
-              <w:t>original</w:t>
+              <w:t>No added noise</w:t>
             </w:r>
           </w:p>
         </w:tc>
@@ -11520,7 +11520,7 @@
               <w:rPr>
                 <w:sz w:val="16"/>
               </w:rPr>
-              <w:t>noise +0.10 C / +0.3 %RH</w:t>
+              <w:t>Noise +0.10 °C / +0.3 %RH</w:t>
             </w:r>
           </w:p>
         </w:tc>
@@ -11634,7 +11634,7 @@
               <w:rPr>
                 <w:sz w:val="16"/>
               </w:rPr>
-              <w:t>noise +0.20 C / +0.6 %RH</w:t>
+              <w:t>Noise +0.20 °C / +0.6 %RH</w:t>
             </w:r>
           </w:p>
         </w:tc>
@@ -11742,7 +11742,7 @@
         <w:jc w:val="both"/>
       </w:pPr>
       <w:r>
-        <w:t xml:space="preserve">Table 10 repeats the decisive shift of Section 6.3 on the real deployment: the trained models are applied to test motes whose transducers have become noisier. At the strongest level macro-F1 falls by 0.051 for PIRCAD (random forest), 0.001 for Multi-scale 1D-CNN, 0.173 for Generic-feature RF. The generic forest degrades to PIRCAD's level, as in simulation, but the CNN is essentially unaffected: on real data, whose own variability is large relative to the added noise, its standardised multi-scale input absorbs the shift. The robustness advantage PIRCAD showed in simulation therefore does </w:t>
+        <w:t xml:space="preserve">Table 10 repeats the decisive shift of Section 6.3 on the real deployment: the trained models are applied to test motes whose transducers have become noisier. At the strongest level macro-F1 falls by 0.051 for PIRCAD, 0.001 for the CNN and 0.173 for the generic-feature forest. The generic forest degrades to PIRCAD's level, as in simulation, but the CNN is essentially unaffected: on real data, whose own variability is large relative to the added noise, its standardised multi-scale input absorbs the shift. The robustness advantage PIRCAD showed in simulation therefore does </w:t>
       </w:r>
       <w:r>
         <w:rPr>
@@ -11759,7 +11759,7 @@
         <w:jc w:val="both"/>
       </w:pPr>
       <w:r>
-        <w:t>Two simulated findings do carry over, in weakened form. The on-path ramp (A4) is again unlabelable — the learned baselines call it drift (poisoning recall 0.02 and 0.00); PIRCAD flags 0.35 of it, largely because its noisier real-data residual triggers poisoning verdicts on drift-like ramps too, so this is not evidence of separability. And only the system that corrects against an independent reference delivers a usable channel: PIRCAD forwards 34 % of the attacked channel and 35 % of a genuinely drifting one within 0.5 °C of the truth, against 5–7 % for the label-only learners — a sixfold difference, but far from the 99 % achieved in simulation, because the real-data correction is only as accurate as the real-data expectation.</w:t>
+        <w:t>Two simulated findings do carry over, in weakened form. The on-path ramp (A4) again cannot be labelled — the learned baselines call it drift (poisoning recall 0.02 and 0.00); PIRCAD flags 0.35 of it, largely because its noisier real-data residual triggers poisoning verdicts on drift-like ramps too, so this is not evidence of separability. And only the system that corrects against an independent reference delivers a usable channel: PIRCAD forwards 34 % of the attacked channel and 35 % of a genuinely drifting one within 0.5 °C of the truth, against 5–7 % for the label-only learners — a sixfold difference, but far from the 99 % achieved in simulation, because the real-data correction is only as accurate as the real-data expectation.</w:t>
       </w:r>
     </w:p>
     <w:p>
@@ -12156,7 +12156,7 @@
               <w:rPr>
                 <w:sz w:val="16"/>
               </w:rPr>
-              <w:t>- physics residual (rolling mean)</w:t>
+              <w:t>− physics residual (rolling mean)</w:t>
             </w:r>
           </w:p>
         </w:tc>
@@ -12293,7 +12293,7 @@
               <w:rPr>
                 <w:sz w:val="16"/>
               </w:rPr>
-              <w:t>- dedicated observers</w:t>
+              <w:t>− dedicated observers</w:t>
             </w:r>
           </w:p>
         </w:tc>
@@ -12423,7 +12423,7 @@
               <w:rPr>
                 <w:sz w:val="16"/>
               </w:rPr>
-              <w:t>- cross-sensor consistency</w:t>
+              <w:t>− cross-sensor consistency</w:t>
             </w:r>
           </w:p>
         </w:tc>
@@ -12553,7 +12553,7 @@
               <w:rPr>
                 <w:sz w:val="16"/>
               </w:rPr>
-              <w:t>- excitation coherence</w:t>
+              <w:t>− excitation coherence</w:t>
             </w:r>
           </w:p>
         </w:tc>
@@ -12683,7 +12683,7 @@
               <w:rPr>
                 <w:sz w:val="16"/>
               </w:rPr>
-              <w:t>- noise-signature features</w:t>
+              <w:t>− noise-signature features</w:t>
             </w:r>
           </w:p>
         </w:tc>
@@ -12820,7 +12820,7 @@
               <w:rPr>
                 <w:sz w:val="16"/>
               </w:rPr>
-              <w:t>- all character features</w:t>
+              <w:t>− all character features</w:t>
             </w:r>
           </w:p>
         </w:tc>
@@ -12957,7 +12957,7 @@
               <w:rPr>
                 <w:sz w:val="16"/>
               </w:rPr>
-              <w:t>- adaptation governor</w:t>
+              <w:t>− adaptation governor</w:t>
             </w:r>
           </w:p>
         </w:tc>
@@ -13087,7 +13087,7 @@
               <w:rPr>
                 <w:sz w:val="16"/>
               </w:rPr>
-              <w:t>- differential response</w:t>
+              <w:t>− differential response</w:t>
             </w:r>
           </w:p>
         </w:tc>
@@ -13218,7 +13218,7 @@
         <w:jc w:val="both"/>
       </w:pPr>
       <w:r>
-        <w:t>Table 11 removes one element at a time. The physics residual carries the result: replacing it by the channel's own rolling mean lowers macro-F1 from 0.943 to 0.642, cuts poisoning containment to 0.51, and lets 35 % of genuine process events be mislabelled as instrument faults. Removing the whole group of residual-character features costs 0.075 (p = &lt;10</w:t>
+        <w:t>Table 11 removes one element at a time. The physics residual carries the result: replacing it by the channel's own rolling mean lowers macro-F1 from 0.943 to 0.642, cuts poisoning containment to 0.51, and lets 35 % of genuine process events be mislabelled as instrument faults. Removing the whole group of residual-character features costs 0.075 (p &lt; 10</w:t>
       </w:r>
       <w:r>
         <w:rPr>
@@ -13235,7 +13235,7 @@
         <w:jc w:val="both"/>
       </w:pPr>
       <w:r>
-        <w:t>Two results contradict claims made in the original version of this work. Replacing the dedicated observers by one shared closed-loop estimator does not significantly change macro-F1 (0.930, p = 0.54) once the classifier is retrained on the changed features: the bias is attenuated in a shared estimator's residual, but the trigger and the remaining features still see it. And removing the cross-sensor localisation leaves macro-F1 unchanged (0.937, p = 0.68); in this plant the residual character alone suffices to recognise the process event. We therefore do not claim either element as necessary for classification in distribution. The leave-one-out structure is kept because Proposition 2 requires an expectation that excludes the channel; in this plant a shared estimator happens to draw most of its weight from the other instruments, so the difference is small here but is not guaranteed in general.</w:t>
+        <w:t>Two results contradict hypotheses that motivated our initial design. Replacing the dedicated observers by one shared closed-loop estimator does not significantly change macro-F1 (0.930, p = 0.54) once the classifier is retrained on the changed features: the bias is attenuated in a shared estimator's residual, but the trigger and the remaining features still see it. And removing the cross-sensor localisation leaves macro-F1 unchanged (0.937, p = 0.68); in this plant the residual character alone suffices to recognise the process event. We therefore do not claim either element as necessary for classification in distribution. The leave-one-out structure is kept because Proposition 2 requires an expectation that excludes the channel; in this plant a shared estimator happens to draw most of its weight from the other instruments, so the difference is small here but is not guaranteed in general.</w:t>
       </w:r>
     </w:p>
     <w:p>
@@ -13385,7 +13385,7 @@
               <w:rPr>
                 <w:sz w:val="18"/>
               </w:rPr>
-              <w:t>nominal (exp. 6 bank)</w:t>
+              <w:t>Nominal (180-episode bank)</w:t>
             </w:r>
           </w:p>
         </w:tc>
@@ -13467,7 +13467,7 @@
               <w:rPr>
                 <w:sz w:val="18"/>
               </w:rPr>
-              <w:t>plant dynamics +20%</w:t>
+              <w:t>Plant dynamics +20 %</w:t>
             </w:r>
           </w:p>
         </w:tc>
@@ -13549,7 +13549,7 @@
               <w:rPr>
                 <w:sz w:val="18"/>
               </w:rPr>
-              <w:t>noise x2</w:t>
+              <w:t>Sensor noise ×2</w:t>
             </w:r>
           </w:p>
         </w:tc>
@@ -13631,7 +13631,7 @@
               <w:rPr>
                 <w:sz w:val="18"/>
               </w:rPr>
-              <w:t>noise x3</w:t>
+              <w:t>Sensor noise ×3</w:t>
             </w:r>
           </w:p>
         </w:tc>
@@ -13780,7 +13780,7 @@
         <w:jc w:val="both"/>
       </w:pPr>
       <w:r>
-        <w:t>Over the 180 held-out episodes, PIRCAD processes a four-channel frame in a median of 0.42 ms (95th percentile 0.68 ms) in single-threaded Python on an Apple-silicon laptop, and the expensive stages run on 31 % of channel-samples. The single-sample forest evaluation of Section 4.4 is what makes this feasible: the library implementation spends about 16 ms per single-sample call on per-tree task dispatch, which made the original pipeline 30× slower with identical outputs. The two-channel edge kernel runs in closed form on an ESP32-class microcontroller (Section 6.8).</w:t>
+        <w:t>Over the 180 held-out episodes, PIRCAD processes a four-channel frame in a median of 0.42 ms (95th percentile 0.68 ms) in single-threaded Python on an Apple-silicon laptop, and the expensive stages run on 31 % of channel-samples. The single-sample forest evaluation of Section 4.4 is what makes this feasible: the library implementation spends about 16 ms per single-sample call on per-tree task dispatch, which made a straightforward implementation 30× slower with identical outputs. The two-channel edge kernel runs in closed form on an ESP32-class microcontroller (Section 6.8).</w:t>
       </w:r>
     </w:p>
     <w:p>
@@ -13796,7 +13796,7 @@
         <w:jc w:val="both"/>
       </w:pPr>
       <w:r>
-        <w:t>The same architecture was reduced to closed form for an ESP32 DevKit with a single DHT22, whose temperature and humidity transducers supply the cross-channel redundancy through the Magnus relation; the decision kernel (about 4 µs per sample, compiled C++) runs in the Wokwi simulator and is unchanged from the original version of this work. With no learned model on the node, it recalls 88.1 % and 87.5 % of linear and exponential drift, 100 % of step and spike injections and 93.1 % of a drift-shaped ramp above the ageing envelope, and admits under 1 °C of a 6 °C step or a stealth ramp into its reference, against 5.8–6.8 °C for a rolling-mean baseline. A ramp matched to the benign drift rate is not separable with two channels at one node — the regression suite asserts that it fails — which is the single-node instance of Proposition 1. The node has not yet been run on physical silicon.</w:t>
+        <w:t>The same architecture was reduced to closed form for an ESP32 DevKit with a single DHT22, whose temperature and humidity transducers supply the cross-channel redundancy through the Magnus relation; the decision kernel (about 4 µs per sample, compiled C++) runs in the Wokwi simulator and is unchanged from our earlier prototype. With no learned model on the node, it recalls 88.1 % and 87.5 % of linear and exponential drift, 100 % of step and spike injections and 93.1 % of a drift-shaped ramp above the ageing envelope, and admits under 1 °C of a 6 °C step or a stealth ramp into its reference, against 5.8–6.8 °C for a rolling-mean baseline. A ramp matched to the benign drift rate is not separable with two channels at one node — the regression suite asserts that it fails — which is the single-node instance of Proposition 1. The node has not yet been run on physical silicon.</w:t>
       </w:r>
     </w:p>
     <w:p>
@@ -13922,7 +13922,7 @@
         <w:jc w:val="both"/>
       </w:pPr>
       <w:r>
-        <w:t>The original version of this work reported its results on four seeds against its own predecessor. Re-evaluating it at the scale reported here exposed three defects, each invisible to the original benchmark:</w:t>
+        <w:t>Our earlier prototype of this system was evaluated on four seeds against its own predecessor. Re-evaluating it at the scale reported here exposed three defects, each invisible to the original benchmark:</w:t>
       </w:r>
     </w:p>
     <w:p>
@@ -15015,7 +15015,6 @@
       <w:pgMar w:top="1417" w:right="1417" w:bottom="1417" w:left="1417" w:header="720" w:footer="720" w:gutter="0"/>
       <w:cols w:space="720"/>
       <w:docGrid w:linePitch="360"/>
-      <w:lnNumType w:countBy="1" w:restart="continuous"/>
     </w:sectPr>
   </w:body>
 </w:document>

</xml_diff>

<commit_message>
Paper: number authors 1-4 with per-author affiliation and e-mail
</commit_message>
<xml_diff>
--- a/paper/Drift_or_Deception_MLWA_final.docx
+++ b/paper/Drift_or_Deception_MLWA_final.docx
@@ -29,7 +29,7 @@
           <w:sz w:val="22"/>
           <w:vertAlign w:val="superscript"/>
         </w:rPr>
-        <w:t>a</w:t>
+        <w:t>1</w:t>
       </w:r>
       <w:r>
         <w:rPr>
@@ -42,7 +42,7 @@
           <w:sz w:val="22"/>
           <w:vertAlign w:val="superscript"/>
         </w:rPr>
-        <w:t>a</w:t>
+        <w:t>2</w:t>
       </w:r>
       <w:r>
         <w:rPr>
@@ -55,7 +55,7 @@
           <w:sz w:val="22"/>
           <w:vertAlign w:val="superscript"/>
         </w:rPr>
-        <w:t>a</w:t>
+        <w:t>3</w:t>
       </w:r>
       <w:r>
         <w:rPr>
@@ -68,7 +68,7 @@
           <w:sz w:val="22"/>
           <w:vertAlign w:val="superscript"/>
         </w:rPr>
-        <w:t>a,*</w:t>
+        <w:t>4,*</w:t>
       </w:r>
     </w:p>
     <w:p>
@@ -81,14 +81,14 @@
           <w:sz w:val="20"/>
           <w:vertAlign w:val="superscript"/>
         </w:rPr>
-        <w:t>a</w:t>
+        <w:t>1</w:t>
       </w:r>
       <w:r>
         <w:rPr>
           <w:i/>
           <w:sz w:val="20"/>
         </w:rPr>
-        <w:t xml:space="preserve"> School of Computer Science and Engineering, Vellore Institute of Technology, Vellore, Tamil Nadu 632014, India</w:t>
+        <w:t xml:space="preserve"> School of Computer Science and Engineering, Vellore Institute of Technology, Vellore, Tamil Nadu 632014, India. E-mail: pushkal.gupta2023@vitstudent.ac.in</w:t>
       </w:r>
     </w:p>
     <w:p>
@@ -97,6 +97,66 @@
       </w:pPr>
       <w:r>
         <w:rPr>
+          <w:i/>
+          <w:sz w:val="20"/>
+          <w:vertAlign w:val="superscript"/>
+        </w:rPr>
+        <w:t>2</w:t>
+      </w:r>
+      <w:r>
+        <w:rPr>
+          <w:i/>
+          <w:sz w:val="20"/>
+        </w:rPr>
+        <w:t xml:space="preserve"> School of Computer Science and Engineering, Vellore Institute of Technology, Vellore, Tamil Nadu 632014, India. E-mail: shridhar.m2023@vitstudent.ac.in</w:t>
+      </w:r>
+    </w:p>
+    <w:p>
+      <w:pPr>
+        <w:jc w:val="center"/>
+      </w:pPr>
+      <w:r>
+        <w:rPr>
+          <w:i/>
+          <w:sz w:val="20"/>
+          <w:vertAlign w:val="superscript"/>
+        </w:rPr>
+        <w:t>3</w:t>
+      </w:r>
+      <w:r>
+        <w:rPr>
+          <w:i/>
+          <w:sz w:val="20"/>
+        </w:rPr>
+        <w:t xml:space="preserve"> School of Computer Science and Engineering, Vellore Institute of Technology, Vellore, Tamil Nadu 632014, India. E-mail: vanka.kaushik2023@vitstudent.ac.in</w:t>
+      </w:r>
+    </w:p>
+    <w:p>
+      <w:pPr>
+        <w:jc w:val="center"/>
+      </w:pPr>
+      <w:r>
+        <w:rPr>
+          <w:i/>
+          <w:sz w:val="20"/>
+          <w:vertAlign w:val="superscript"/>
+        </w:rPr>
+        <w:t>4</w:t>
+      </w:r>
+      <w:r>
+        <w:rPr>
+          <w:i/>
+          <w:sz w:val="20"/>
+        </w:rPr>
+        <w:t xml:space="preserve"> School of Computer Science and Engineering, Vellore Institute of Technology, Vellore, Tamil Nadu 632014, India. E-mail: syamasudha.v@vit.ac.in</w:t>
+      </w:r>
+    </w:p>
+    <w:p>
+      <w:pPr>
+        <w:jc w:val="center"/>
+      </w:pPr>
+      <w:r>
+        <w:rPr>
           <w:sz w:val="18"/>
           <w:vertAlign w:val="superscript"/>
         </w:rPr>
@@ -106,7 +166,7 @@
         <w:rPr>
           <w:sz w:val="18"/>
         </w:rPr>
-        <w:t xml:space="preserve"> Corresponding author: Syamasudha Veeragandham. E-mail addresses: pushkal.gupta2023@vitstudent.ac.in (P. Gupta), shridhar.m2023@vitstudent.ac.in (S. M), vanka.kaushik2023@vitstudent.ac.in (V. Kaushik), syamasudha.v@vit.ac.in (S. Veeragandham).</w:t>
+        <w:t xml:space="preserve"> Corresponding author: Syamasudha Veeragandham (syamasudha.v@vit.ac.in).</w:t>
       </w:r>
     </w:p>
     <w:p>

</xml_diff>

<commit_message>
Paper: restore single affiliation line, authors numbered 1-4
</commit_message>
<xml_diff>
--- a/paper/Drift_or_Deception_MLWA_final.docx
+++ b/paper/Drift_or_Deception_MLWA_final.docx
@@ -81,14 +81,14 @@
           <w:sz w:val="20"/>
           <w:vertAlign w:val="superscript"/>
         </w:rPr>
-        <w:t>1</w:t>
+        <w:t>1,2,3,4</w:t>
       </w:r>
       <w:r>
         <w:rPr>
           <w:i/>
           <w:sz w:val="20"/>
         </w:rPr>
-        <w:t xml:space="preserve"> School of Computer Science and Engineering, Vellore Institute of Technology, Vellore, Tamil Nadu 632014, India. E-mail: pushkal.gupta2023@vitstudent.ac.in</w:t>
+        <w:t xml:space="preserve"> School of Computer Science and Engineering, Vellore Institute of Technology, Vellore, Tamil Nadu 632014, India</w:t>
       </w:r>
     </w:p>
     <w:p>
@@ -97,66 +97,6 @@
       </w:pPr>
       <w:r>
         <w:rPr>
-          <w:i/>
-          <w:sz w:val="20"/>
-          <w:vertAlign w:val="superscript"/>
-        </w:rPr>
-        <w:t>2</w:t>
-      </w:r>
-      <w:r>
-        <w:rPr>
-          <w:i/>
-          <w:sz w:val="20"/>
-        </w:rPr>
-        <w:t xml:space="preserve"> School of Computer Science and Engineering, Vellore Institute of Technology, Vellore, Tamil Nadu 632014, India. E-mail: shridhar.m2023@vitstudent.ac.in</w:t>
-      </w:r>
-    </w:p>
-    <w:p>
-      <w:pPr>
-        <w:jc w:val="center"/>
-      </w:pPr>
-      <w:r>
-        <w:rPr>
-          <w:i/>
-          <w:sz w:val="20"/>
-          <w:vertAlign w:val="superscript"/>
-        </w:rPr>
-        <w:t>3</w:t>
-      </w:r>
-      <w:r>
-        <w:rPr>
-          <w:i/>
-          <w:sz w:val="20"/>
-        </w:rPr>
-        <w:t xml:space="preserve"> School of Computer Science and Engineering, Vellore Institute of Technology, Vellore, Tamil Nadu 632014, India. E-mail: vanka.kaushik2023@vitstudent.ac.in</w:t>
-      </w:r>
-    </w:p>
-    <w:p>
-      <w:pPr>
-        <w:jc w:val="center"/>
-      </w:pPr>
-      <w:r>
-        <w:rPr>
-          <w:i/>
-          <w:sz w:val="20"/>
-          <w:vertAlign w:val="superscript"/>
-        </w:rPr>
-        <w:t>4</w:t>
-      </w:r>
-      <w:r>
-        <w:rPr>
-          <w:i/>
-          <w:sz w:val="20"/>
-        </w:rPr>
-        <w:t xml:space="preserve"> School of Computer Science and Engineering, Vellore Institute of Technology, Vellore, Tamil Nadu 632014, India. E-mail: syamasudha.v@vit.ac.in</w:t>
-      </w:r>
-    </w:p>
-    <w:p>
-      <w:pPr>
-        <w:jc w:val="center"/>
-      </w:pPr>
-      <w:r>
-        <w:rPr>
           <w:sz w:val="18"/>
           <w:vertAlign w:val="superscript"/>
         </w:rPr>
@@ -166,7 +106,7 @@
         <w:rPr>
           <w:sz w:val="18"/>
         </w:rPr>
-        <w:t xml:space="preserve"> Corresponding author: Syamasudha Veeragandham (syamasudha.v@vit.ac.in).</w:t>
+        <w:t xml:space="preserve"> Corresponding author: Syamasudha Veeragandham. E-mail addresses: pushkal.gupta2023@vitstudent.ac.in (P. Gupta), shridhar.m2023@vitstudent.ac.in (S. M), vanka.kaushik2023@vitstudent.ac.in (V. Kaushik), syamasudha.v@vit.ac.in (S. Veeragandham).</w:t>
       </w:r>
     </w:p>
     <w:p>

</xml_diff>

<commit_message>
Paper: revert author numbering to the single-affiliation 'a' form
</commit_message>
<xml_diff>
--- a/paper/Drift_or_Deception_MLWA_final.docx
+++ b/paper/Drift_or_Deception_MLWA_final.docx
@@ -29,7 +29,7 @@
           <w:sz w:val="22"/>
           <w:vertAlign w:val="superscript"/>
         </w:rPr>
-        <w:t>1</w:t>
+        <w:t>a</w:t>
       </w:r>
       <w:r>
         <w:rPr>
@@ -42,7 +42,7 @@
           <w:sz w:val="22"/>
           <w:vertAlign w:val="superscript"/>
         </w:rPr>
-        <w:t>2</w:t>
+        <w:t>a</w:t>
       </w:r>
       <w:r>
         <w:rPr>
@@ -55,7 +55,7 @@
           <w:sz w:val="22"/>
           <w:vertAlign w:val="superscript"/>
         </w:rPr>
-        <w:t>3</w:t>
+        <w:t>a</w:t>
       </w:r>
       <w:r>
         <w:rPr>
@@ -68,7 +68,7 @@
           <w:sz w:val="22"/>
           <w:vertAlign w:val="superscript"/>
         </w:rPr>
-        <w:t>4,*</w:t>
+        <w:t>a,*</w:t>
       </w:r>
     </w:p>
     <w:p>
@@ -81,7 +81,7 @@
           <w:sz w:val="20"/>
           <w:vertAlign w:val="superscript"/>
         </w:rPr>
-        <w:t>1,2,3,4</w:t>
+        <w:t>a</w:t>
       </w:r>
       <w:r>
         <w:rPr>

</xml_diff>